<commit_message>
18/9 Exported Files fixing
</commit_message>
<xml_diff>
--- a/apps/incidents/report_templates/event_report_template_v1.docx
+++ b/apps/incidents/report_templates/event_report_template_v1.docx
@@ -47,6 +47,7 @@
                 <w:b/>
                 <w:color w:val="1F2933"/>
                 <w:sz w:val="38"/>
+                <w:szCs w:val="38"/>
               </w:rPr>
               <w:t>Alert Event REPORT</w:t>
             </w:r>
@@ -62,6 +63,7 @@
                 <w:b/>
                 <w:color w:val="1F2933"/>
                 <w:sz w:val="28"/>
+                <w:szCs w:val="28"/>
               </w:rPr>
               <w:t>แบบฟอร์มแจ้งเหตุการณ์ผิดปกติ</w:t>
             </w:r>
@@ -114,6 +116,7 @@
                 <w:b/>
                 <w:color w:val="1F2933"/>
                 <w:sz w:val="26"/>
+                <w:szCs w:val="26"/>
               </w:rPr>
               <w:t>1. ข้อมูลทั่วไป (General Information)</w:t>
             </w:r>
@@ -166,6 +169,7 @@
                 <w:b/>
                 <w:color w:val="404040"/>
                 <w:sz w:val="23"/>
+                <w:szCs w:val="23"/>
               </w:rPr>
               <w:t>1.1 หมายเลข Event</w:t>
             </w:r>
@@ -192,6 +196,7 @@
                 <w:b w:val="0"/>
                 <w:color w:val="404040"/>
                 <w:sz w:val="23"/>
+                <w:szCs w:val="23"/>
               </w:rPr>
               <w:t>{{ticket_id}}</w:t>
             </w:r>
@@ -224,6 +229,7 @@
                 <w:b/>
                 <w:color w:val="404040"/>
                 <w:sz w:val="23"/>
+                <w:szCs w:val="23"/>
               </w:rPr>
               <w:t>1.2 วันที่ เวลา ที่พบเหตุ</w:t>
             </w:r>
@@ -250,6 +256,7 @@
                 <w:b w:val="0"/>
                 <w:color w:val="404040"/>
                 <w:sz w:val="23"/>
+                <w:szCs w:val="23"/>
               </w:rPr>
               <w:t>{{incident_datetime}}</w:t>
             </w:r>
@@ -282,6 +289,7 @@
                 <w:b/>
                 <w:color w:val="404040"/>
                 <w:sz w:val="23"/>
+                <w:szCs w:val="23"/>
               </w:rPr>
               <w:t>1.3 วันที่ เวลา ที่เกิดเหตุ</w:t>
             </w:r>
@@ -308,6 +316,7 @@
                 <w:b w:val="0"/>
                 <w:color w:val="404040"/>
                 <w:sz w:val="23"/>
+                <w:szCs w:val="23"/>
               </w:rPr>
               <w:t>{{event_occurred_at}}</w:t>
             </w:r>
@@ -340,6 +349,7 @@
                 <w:b/>
                 <w:color w:val="404040"/>
                 <w:sz w:val="23"/>
+                <w:szCs w:val="23"/>
               </w:rPr>
               <w:t>1.4 ชื่อ Event</w:t>
             </w:r>
@@ -366,6 +376,7 @@
                 <w:b w:val="0"/>
                 <w:color w:val="404040"/>
                 <w:sz w:val="23"/>
+                <w:szCs w:val="23"/>
               </w:rPr>
               <w:t>{{incident_name}}</w:t>
             </w:r>
@@ -398,6 +409,7 @@
                 <w:b/>
                 <w:color w:val="404040"/>
                 <w:sz w:val="23"/>
+                <w:szCs w:val="23"/>
               </w:rPr>
               <w:t>1.5 ประเภท</w:t>
             </w:r>
@@ -424,6 +436,7 @@
                 <w:b w:val="0"/>
                 <w:color w:val="404040"/>
                 <w:sz w:val="21"/>
+                <w:szCs w:val="21"/>
               </w:rPr>
               <w:t>{{chk_class_event}}</w:t>
             </w:r>
@@ -433,6 +446,7 @@
                 <w:b w:val="0"/>
                 <w:color w:val="404040"/>
                 <w:sz w:val="23"/>
+                <w:szCs w:val="23"/>
               </w:rPr>
               <w:t xml:space="preserve"> Event</w:t>
             </w:r>
@@ -442,6 +456,7 @@
                 <w:b w:val="0"/>
                 <w:color w:val="404040"/>
                 <w:sz w:val="23"/>
+                <w:szCs w:val="23"/>
               </w:rPr>
               <w:t xml:space="preserve">   </w:t>
             </w:r>
@@ -451,6 +466,7 @@
                 <w:b w:val="0"/>
                 <w:color w:val="404040"/>
                 <w:sz w:val="21"/>
+                <w:szCs w:val="21"/>
               </w:rPr>
               <w:t>{{chk_class_incident}}</w:t>
             </w:r>
@@ -460,6 +476,7 @@
                 <w:b w:val="0"/>
                 <w:color w:val="404040"/>
                 <w:sz w:val="23"/>
+                <w:szCs w:val="23"/>
               </w:rPr>
               <w:t xml:space="preserve"> Incident</w:t>
             </w:r>
@@ -492,6 +509,7 @@
                 <w:b/>
                 <w:color w:val="404040"/>
                 <w:sz w:val="23"/>
+                <w:szCs w:val="23"/>
               </w:rPr>
               <w:t>1.6 ระดับความสำคัญ</w:t>
             </w:r>
@@ -518,6 +536,7 @@
                 <w:b w:val="0"/>
                 <w:color w:val="404040"/>
                 <w:sz w:val="21"/>
+                <w:szCs w:val="21"/>
               </w:rPr>
               <w:t>{{chk_imp_general}}</w:t>
             </w:r>
@@ -527,6 +546,7 @@
                 <w:b w:val="0"/>
                 <w:color w:val="404040"/>
                 <w:sz w:val="23"/>
+                <w:szCs w:val="23"/>
               </w:rPr>
               <w:t xml:space="preserve"> ปกติทั่วไป</w:t>
             </w:r>
@@ -536,6 +556,7 @@
                 <w:b w:val="0"/>
                 <w:color w:val="404040"/>
                 <w:sz w:val="23"/>
+                <w:szCs w:val="23"/>
               </w:rPr>
               <w:t xml:space="preserve">   </w:t>
             </w:r>
@@ -545,6 +566,7 @@
                 <w:b w:val="0"/>
                 <w:color w:val="404040"/>
                 <w:sz w:val="21"/>
+                <w:szCs w:val="21"/>
               </w:rPr>
               <w:t>{{chk_imp_normal}}</w:t>
             </w:r>
@@ -554,6 +576,7 @@
                 <w:b w:val="0"/>
                 <w:color w:val="404040"/>
                 <w:sz w:val="23"/>
+                <w:szCs w:val="23"/>
               </w:rPr>
               <w:t xml:space="preserve"> สำคัญ</w:t>
             </w:r>
@@ -563,6 +586,7 @@
                 <w:b w:val="0"/>
                 <w:color w:val="404040"/>
                 <w:sz w:val="23"/>
+                <w:szCs w:val="23"/>
               </w:rPr>
               <w:t xml:space="preserve">   </w:t>
             </w:r>
@@ -572,6 +596,7 @@
                 <w:b w:val="0"/>
                 <w:color w:val="404040"/>
                 <w:sz w:val="21"/>
+                <w:szCs w:val="21"/>
               </w:rPr>
               <w:t>{{chk_imp_high}}</w:t>
             </w:r>
@@ -581,6 +606,7 @@
                 <w:b w:val="0"/>
                 <w:color w:val="404040"/>
                 <w:sz w:val="23"/>
+                <w:szCs w:val="23"/>
               </w:rPr>
               <w:t xml:space="preserve"> สำคัญมาก</w:t>
             </w:r>
@@ -613,6 +639,7 @@
                 <w:b/>
                 <w:color w:val="404040"/>
                 <w:sz w:val="23"/>
+                <w:szCs w:val="23"/>
               </w:rPr>
               <w:t>1.7 ระดับความรุนแรง (อ้างอิงตามระบบ SIEM)</w:t>
             </w:r>
@@ -639,6 +666,7 @@
                 <w:b w:val="0"/>
                 <w:color w:val="404040"/>
                 <w:sz w:val="21"/>
+                <w:szCs w:val="21"/>
               </w:rPr>
               <w:t>{{chk_sev_low}}</w:t>
             </w:r>
@@ -648,6 +676,7 @@
                 <w:b w:val="0"/>
                 <w:color w:val="404040"/>
                 <w:sz w:val="23"/>
+                <w:szCs w:val="23"/>
               </w:rPr>
               <w:t xml:space="preserve"> Low</w:t>
             </w:r>
@@ -657,6 +686,7 @@
                 <w:b w:val="0"/>
                 <w:color w:val="404040"/>
                 <w:sz w:val="23"/>
+                <w:szCs w:val="23"/>
               </w:rPr>
               <w:t xml:space="preserve">   </w:t>
             </w:r>
@@ -666,6 +696,7 @@
                 <w:b w:val="0"/>
                 <w:color w:val="404040"/>
                 <w:sz w:val="21"/>
+                <w:szCs w:val="21"/>
               </w:rPr>
               <w:t>{{chk_sev_medium}}</w:t>
             </w:r>
@@ -675,6 +706,7 @@
                 <w:b w:val="0"/>
                 <w:color w:val="404040"/>
                 <w:sz w:val="23"/>
+                <w:szCs w:val="23"/>
               </w:rPr>
               <w:t xml:space="preserve"> Moderate</w:t>
             </w:r>
@@ -684,6 +716,7 @@
                 <w:b w:val="0"/>
                 <w:color w:val="404040"/>
                 <w:sz w:val="23"/>
+                <w:szCs w:val="23"/>
               </w:rPr>
               <w:t xml:space="preserve">   </w:t>
             </w:r>
@@ -693,6 +726,7 @@
                 <w:b w:val="0"/>
                 <w:color w:val="404040"/>
                 <w:sz w:val="21"/>
+                <w:szCs w:val="21"/>
               </w:rPr>
               <w:t>{{chk_sev_high}}</w:t>
             </w:r>
@@ -702,6 +736,7 @@
                 <w:b w:val="0"/>
                 <w:color w:val="404040"/>
                 <w:sz w:val="23"/>
+                <w:szCs w:val="23"/>
               </w:rPr>
               <w:t xml:space="preserve"> High</w:t>
             </w:r>
@@ -711,6 +746,7 @@
                 <w:b w:val="0"/>
                 <w:color w:val="404040"/>
                 <w:sz w:val="23"/>
+                <w:szCs w:val="23"/>
               </w:rPr>
               <w:t xml:space="preserve">   </w:t>
             </w:r>
@@ -720,6 +756,7 @@
                 <w:b w:val="0"/>
                 <w:color w:val="404040"/>
                 <w:sz w:val="21"/>
+                <w:szCs w:val="21"/>
               </w:rPr>
               <w:t>{{chk_sev_critical}}</w:t>
             </w:r>
@@ -729,6 +766,7 @@
                 <w:b w:val="0"/>
                 <w:color w:val="404040"/>
                 <w:sz w:val="23"/>
+                <w:szCs w:val="23"/>
               </w:rPr>
               <w:t xml:space="preserve"> Critical</w:t>
             </w:r>
@@ -761,6 +799,7 @@
                 <w:b/>
                 <w:color w:val="404040"/>
                 <w:sz w:val="23"/>
+                <w:szCs w:val="23"/>
               </w:rPr>
               <w:t>1.8 ระดับความรุนแรง (อ้างอิงตาม สกมช.)</w:t>
             </w:r>
@@ -787,6 +826,7 @@
                 <w:b w:val="0"/>
                 <w:color w:val="404040"/>
                 <w:sz w:val="21"/>
+                <w:szCs w:val="21"/>
               </w:rPr>
               <w:t>{{chk_ncsa_nonsevere}}</w:t>
             </w:r>
@@ -796,6 +836,7 @@
                 <w:b w:val="0"/>
                 <w:color w:val="404040"/>
                 <w:sz w:val="23"/>
+                <w:szCs w:val="23"/>
               </w:rPr>
               <w:t xml:space="preserve"> ไม่ร้ายแรง</w:t>
             </w:r>
@@ -805,6 +846,7 @@
                 <w:b w:val="0"/>
                 <w:color w:val="404040"/>
                 <w:sz w:val="23"/>
+                <w:szCs w:val="23"/>
               </w:rPr>
               <w:t xml:space="preserve">   </w:t>
             </w:r>
@@ -814,6 +856,7 @@
                 <w:b w:val="0"/>
                 <w:color w:val="404040"/>
                 <w:sz w:val="21"/>
+                <w:szCs w:val="21"/>
               </w:rPr>
               <w:t>{{chk_ncsa_severe}}</w:t>
             </w:r>
@@ -823,6 +866,7 @@
                 <w:b w:val="0"/>
                 <w:color w:val="404040"/>
                 <w:sz w:val="23"/>
+                <w:szCs w:val="23"/>
               </w:rPr>
               <w:t xml:space="preserve"> ร้ายแรง</w:t>
             </w:r>
@@ -832,6 +876,7 @@
                 <w:b w:val="0"/>
                 <w:color w:val="404040"/>
                 <w:sz w:val="23"/>
+                <w:szCs w:val="23"/>
               </w:rPr>
               <w:t xml:space="preserve">   </w:t>
             </w:r>
@@ -841,6 +886,7 @@
                 <w:b w:val="0"/>
                 <w:color w:val="404040"/>
                 <w:sz w:val="21"/>
+                <w:szCs w:val="21"/>
               </w:rPr>
               <w:t>{{chk_ncsa_critical}}</w:t>
             </w:r>
@@ -850,6 +896,7 @@
                 <w:b w:val="0"/>
                 <w:color w:val="404040"/>
                 <w:sz w:val="23"/>
+                <w:szCs w:val="23"/>
               </w:rPr>
               <w:t xml:space="preserve"> วิกฤต</w:t>
             </w:r>
@@ -882,6 +929,7 @@
                 <w:b/>
                 <w:color w:val="404040"/>
                 <w:sz w:val="23"/>
+                <w:szCs w:val="23"/>
               </w:rPr>
               <w:t>1.9 *หมวดหมู่ของภัยคุกคามทางไซเบอร์ (Category)</w:t>
             </w:r>
@@ -908,6 +956,7 @@
                 <w:b w:val="0"/>
                 <w:color w:val="404040"/>
                 <w:sz w:val="23"/>
+                <w:szCs w:val="23"/>
               </w:rPr>
               <w:t>{{category}}</w:t>
             </w:r>
@@ -940,6 +989,7 @@
                 <w:b/>
                 <w:color w:val="404040"/>
                 <w:sz w:val="23"/>
+                <w:szCs w:val="23"/>
               </w:rPr>
               <w:t>1.10 ทรัพย์สินที่ได้รับผลกระทบ</w:t>
             </w:r>
@@ -966,6 +1016,7 @@
                 <w:b w:val="0"/>
                 <w:color w:val="404040"/>
                 <w:sz w:val="23"/>
+                <w:szCs w:val="23"/>
               </w:rPr>
               <w:t>{{host_ip}}</w:t>
             </w:r>
@@ -998,6 +1049,7 @@
                 <w:b/>
                 <w:color w:val="404040"/>
                 <w:sz w:val="23"/>
+                <w:szCs w:val="23"/>
               </w:rPr>
               <w:t>1.11 ประเภททรัพย์สินที่ได้รับผลกระทบ</w:t>
             </w:r>
@@ -1024,6 +1076,7 @@
                 <w:b w:val="0"/>
                 <w:color w:val="404040"/>
                 <w:sz w:val="21"/>
+                <w:szCs w:val="21"/>
               </w:rPr>
               <w:t>{{chk_asset_computer}}</w:t>
             </w:r>
@@ -1033,6 +1086,7 @@
                 <w:b w:val="0"/>
                 <w:color w:val="404040"/>
                 <w:sz w:val="23"/>
+                <w:szCs w:val="23"/>
               </w:rPr>
               <w:t xml:space="preserve"> Computer</w:t>
             </w:r>
@@ -1042,6 +1096,7 @@
                 <w:b w:val="0"/>
                 <w:color w:val="404040"/>
                 <w:sz w:val="23"/>
+                <w:szCs w:val="23"/>
               </w:rPr>
               <w:t xml:space="preserve">   </w:t>
             </w:r>
@@ -1051,6 +1106,7 @@
                 <w:b w:val="0"/>
                 <w:color w:val="404040"/>
                 <w:sz w:val="21"/>
+                <w:szCs w:val="21"/>
               </w:rPr>
               <w:t>{{chk_asset_server}}</w:t>
             </w:r>
@@ -1060,6 +1116,7 @@
                 <w:b w:val="0"/>
                 <w:color w:val="404040"/>
                 <w:sz w:val="23"/>
+                <w:szCs w:val="23"/>
               </w:rPr>
               <w:t xml:space="preserve"> Server</w:t>
             </w:r>
@@ -1069,6 +1126,7 @@
                 <w:b w:val="0"/>
                 <w:color w:val="404040"/>
                 <w:sz w:val="23"/>
+                <w:szCs w:val="23"/>
               </w:rPr>
               <w:t xml:space="preserve">   </w:t>
             </w:r>
@@ -1078,6 +1136,7 @@
                 <w:b w:val="0"/>
                 <w:color w:val="404040"/>
                 <w:sz w:val="21"/>
+                <w:szCs w:val="21"/>
               </w:rPr>
               <w:t>{{chk_asset_network}}</w:t>
             </w:r>
@@ -1087,6 +1146,7 @@
                 <w:b w:val="0"/>
                 <w:color w:val="404040"/>
                 <w:sz w:val="23"/>
+                <w:szCs w:val="23"/>
               </w:rPr>
               <w:t xml:space="preserve"> Network Device</w:t>
             </w:r>
@@ -1119,6 +1179,7 @@
                 <w:b/>
                 <w:color w:val="404040"/>
                 <w:sz w:val="23"/>
+                <w:szCs w:val="23"/>
               </w:rPr>
               <w:t>1.12 ส่วนงานเจ้าของหรือผู้ดูแลทรัพย์สิน</w:t>
             </w:r>
@@ -1145,6 +1206,7 @@
                 <w:b w:val="0"/>
                 <w:color w:val="404040"/>
                 <w:sz w:val="23"/>
+                <w:szCs w:val="23"/>
               </w:rPr>
               <w:t>{{asset_owner}}</w:t>
             </w:r>
@@ -1177,6 +1239,7 @@
                 <w:b/>
                 <w:color w:val="404040"/>
                 <w:sz w:val="23"/>
+                <w:szCs w:val="23"/>
               </w:rPr>
               <w:t>1.13 รายละเอียด</w:t>
             </w:r>
@@ -1203,6 +1266,7 @@
                 <w:b w:val="0"/>
                 <w:color w:val="404040"/>
                 <w:sz w:val="23"/>
+                <w:szCs w:val="23"/>
               </w:rPr>
               <w:t>{{incident_description}}</w:t>
             </w:r>
@@ -1235,6 +1299,7 @@
                 <w:b/>
                 <w:color w:val="404040"/>
                 <w:sz w:val="23"/>
+                <w:szCs w:val="23"/>
               </w:rPr>
               <w:t>1.14 สถานะปัจจุบัน</w:t>
             </w:r>
@@ -1261,6 +1326,7 @@
                 <w:b w:val="0"/>
                 <w:color w:val="404040"/>
                 <w:sz w:val="23"/>
+                <w:szCs w:val="23"/>
               </w:rPr>
               <w:t>{{status}}</w:t>
             </w:r>
@@ -1293,6 +1359,7 @@
                 <w:b/>
                 <w:color w:val="404040"/>
                 <w:sz w:val="23"/>
+                <w:szCs w:val="23"/>
               </w:rPr>
               <w:t>1.15 เรื่องที่ดำเนินการแล้ว</w:t>
             </w:r>
@@ -1319,6 +1386,7 @@
                 <w:b w:val="0"/>
                 <w:color w:val="404040"/>
                 <w:sz w:val="23"/>
+                <w:szCs w:val="23"/>
               </w:rPr>
               <w:t>{{actions_taken_summary}}</w:t>
             </w:r>
@@ -1351,6 +1419,7 @@
                 <w:b/>
                 <w:color w:val="404040"/>
                 <w:sz w:val="23"/>
+                <w:szCs w:val="23"/>
               </w:rPr>
               <w:t>1.16 การที่จะดำเนินการลำดับถัดไป</w:t>
             </w:r>
@@ -1377,6 +1446,7 @@
                 <w:b w:val="0"/>
                 <w:color w:val="404040"/>
                 <w:sz w:val="23"/>
+                <w:szCs w:val="23"/>
               </w:rPr>
               <w:t>{{next_steps_summary}}</w:t>
             </w:r>
@@ -1409,6 +1479,7 @@
                 <w:b/>
                 <w:color w:val="404040"/>
                 <w:sz w:val="23"/>
+                <w:szCs w:val="23"/>
               </w:rPr>
               <w:t>1.17 ผู้รายงาน</w:t>
             </w:r>
@@ -1435,6 +1506,7 @@
                 <w:b w:val="0"/>
                 <w:color w:val="404040"/>
                 <w:sz w:val="23"/>
+                <w:szCs w:val="23"/>
               </w:rPr>
               <w:t>{{reporter}}</w:t>
             </w:r>
@@ -1467,6 +1539,7 @@
                 <w:b/>
                 <w:color w:val="404040"/>
                 <w:sz w:val="23"/>
+                <w:szCs w:val="23"/>
               </w:rPr>
               <w:t>1.18 แหล่งข้อมูล</w:t>
             </w:r>
@@ -1493,6 +1566,7 @@
                 <w:b w:val="0"/>
                 <w:color w:val="404040"/>
                 <w:sz w:val="23"/>
+                <w:szCs w:val="23"/>
               </w:rPr>
               <w:t>{{log_source}}</w:t>
             </w:r>
@@ -1548,6 +1622,7 @@
               <w:b w:val="0"/>
               <w:color w:val="5B6775"/>
               <w:sz w:val="17"/>
+              <w:szCs w:val="17"/>
             </w:rPr>
             <w:t>ส่วนปฏิบัติการความมั่นคงปลอดภัยไซเบอร์ (ปปกก)   โทร.0-2574-8209-10</w:t>
           </w:r>
@@ -1568,6 +1643,7 @@
               <w:b w:val="0"/>
               <w:color w:val="5B6775"/>
               <w:sz w:val="17"/>
+              <w:szCs w:val="17"/>
             </w:rPr>
             <w:t>ALERT EVENT REPORT แบบฟอร์มแจ้งเหตุการณ์ผิดปกติ</w:t>
           </w:r>
@@ -1994,6 +2070,7 @@
       <w:rFonts w:ascii="TH Sarabun New" w:hAnsi="TH Sarabun New" w:cs="TH Sarabun New"/>
       <w:color w:val="404040"/>
       <w:sz w:val="24"/>
+      <w:szCs w:val="24"/>
     </w:rPr>
   </w:style>
   <w:style w:type="paragraph" w:styleId="Header">

</xml_diff>